<commit_message>
Actualizacion del historial de revisiones
</commit_message>
<xml_diff>
--- a/Desarrollo/Sistema de Control de Peso (SISCOP)/Pruebas/SISCOP-RVF.docx
+++ b/Desarrollo/Sistema de Control de Peso (SISCOP)/Pruebas/SISCOP-RVF.docx
@@ -66,12 +66,12 @@
           <wp:inline distB="114300" distT="114300" distL="114300" distR="114300">
             <wp:extent cx="447675" cy="57150"/>
             <wp:effectExtent b="0" l="0" r="0" t="0"/>
-            <wp:docPr descr="línea corta" id="2" name="image2.png"/>
+            <wp:docPr descr="línea corta" id="2" name="image1.png"/>
             <a:graphic>
               <a:graphicData uri="http://schemas.openxmlformats.org/drawingml/2006/picture">
                 <pic:pic>
                   <pic:nvPicPr>
-                    <pic:cNvPr descr="línea corta" id="0" name="image2.png"/>
+                    <pic:cNvPr descr="línea corta" id="0" name="image1.png"/>
                     <pic:cNvPicPr preferRelativeResize="0"/>
                   </pic:nvPicPr>
                   <pic:blipFill>
@@ -624,7 +624,7 @@
               <w:rPr>
                 <w:rtl w:val="0"/>
               </w:rPr>
-              <w:t xml:space="preserve">Versión preliminar de del reporte de corrección de errores</w:t>
+              <w:t xml:space="preserve">Versión preliminar de del reporte de validación de errores</w:t>
             </w:r>
           </w:p>
         </w:tc>
@@ -1240,7 +1240,7 @@
     </w:p>
     <w:sdt>
       <w:sdtPr>
-        <w:id w:val="-184161488"/>
+        <w:id w:val="-568557350"/>
         <w:docPartObj>
           <w:docPartGallery w:val="Table of Contents"/>
           <w:docPartUnique w:val="1"/>
@@ -1982,7 +1982,7 @@
         <w:rPr>
           <w:rtl w:val="0"/>
         </w:rPr>
-        <w:t xml:space="preserve">Se verificó el correcto funcionamiento de las operaciones principales de cada módulo, incluyendo el registro, consulta, actualización y visualización de información correspondiente a cada proceso.</w:t>
+        <w:t xml:space="preserve">Se verificó el correcto funcionamiento de las operaciones principales de cada módulo, incluyendo el registro, consulta, actualización y visualización de información.</w:t>
       </w:r>
     </w:p>
     <w:p>
@@ -2069,12 +2069,12 @@
           <wp:extent cx="7781925" cy="409575"/>
           <wp:effectExtent b="0" l="0" r="0" t="0"/>
           <wp:wrapNone/>
-          <wp:docPr descr="pie de página" id="3" name="image1.png"/>
+          <wp:docPr descr="pie de página" id="3" name="image2.png"/>
           <a:graphic>
             <a:graphicData uri="http://schemas.openxmlformats.org/drawingml/2006/picture">
               <pic:pic>
                 <pic:nvPicPr>
-                  <pic:cNvPr descr="pie de página" id="0" name="image1.png"/>
+                  <pic:cNvPr descr="pie de página" id="0" name="image2.png"/>
                   <pic:cNvPicPr preferRelativeResize="0"/>
                 </pic:nvPicPr>
                 <pic:blipFill>
@@ -2126,12 +2126,12 @@
           <wp:extent cx="8801100" cy="223838"/>
           <wp:effectExtent b="0" l="0" r="0" t="0"/>
           <wp:wrapNone/>
-          <wp:docPr descr="línea horizontal" id="1" name="image1.png"/>
+          <wp:docPr descr="línea horizontal" id="1" name="image2.png"/>
           <a:graphic>
             <a:graphicData uri="http://schemas.openxmlformats.org/drawingml/2006/picture">
               <pic:pic>
                 <pic:nvPicPr>
-                  <pic:cNvPr descr="línea horizontal" id="0" name="image1.png"/>
+                  <pic:cNvPr descr="línea horizontal" id="0" name="image2.png"/>
                   <pic:cNvPicPr preferRelativeResize="0"/>
                 </pic:nvPicPr>
                 <pic:blipFill>

</xml_diff>